<commit_message>
Bring the documentation back in line with the code
Four documents had drifted. The roadmap still listed the MoMo push
screen as "genuinely missing rather than merely unwritten" when it is
built and working against the sandbox; it still called password reset
absent and AI cost unmeasured. Security listed both as weaknesses.
Architecture described billing as Flutterwave-only and the admin module
as a read-only dashboard.

Also records the two things the MoMo sandbox taught, so nobody rediscovers
them: it settles EUR only, and MTN rejects non-ASCII in the handset prompt
with a bodyless 400 — an em dash in a plan name once broke every checkout.

Word versions regenerated from the markdown.
</commit_message>
<xml_diff>
--- a/docs/word/ARCHITECTURE.docx
+++ b/docs/word/ARCHITECTURE.docx
@@ -29,7 +29,7 @@
           <w:sz w:val="18"/>
           <w:szCs w:val="18"/>
         </w:rPr>
-        <w:t xml:space="preserve">Generated from the repository on 2026-08-11. The markdown source is authoritative.</w:t>
+        <w:t xml:space="preserve">Generated from the repository on 2026-08-17. The markdown source is authoritative.</w:t>
       </w:r>
     </w:p>
     <w:p>
@@ -221,7 +221,23 @@
           <w:sz w:val="18"/>
           <w:szCs w:val="18"/>
         </w:rPr>
-        <w:t xml:space="preserve">                          ├──▶  Flutterwave     (subscriptions + invoice payment)</w:t>
+        <w:t xml:space="preserve">                          ├──▶  MTN MoMo / Flutterwave  (subscriptions + invoice payment)</w:t>
+      </w:r>
+    </w:p>
+    <w:p>
+      <w:pPr>
+        <w:shd w:fill="F3F4F6" w:val="clear"/>
+        <w:spacing w:after="0" w:before="0"/>
+        <w:ind w:left="200" w:right="200"/>
+      </w:pPr>
+      <w:r>
+        <w:rPr>
+          <w:rFonts w:ascii="Consolas" w:cs="Consolas" w:eastAsia="Consolas" w:hAnsi="Consolas"/>
+          <w:color w:val="111827"/>
+          <w:sz w:val="18"/>
+          <w:szCs w:val="18"/>
+        </w:rPr>
+        <w:t xml:space="preserve">                          ├──▶  Africa's Talking / Twilio  (SMS)</w:t>
       </w:r>
     </w:p>
     <w:p>
@@ -237,7 +253,7 @@
           <w:sz w:val="18"/>
           <w:szCs w:val="18"/>
         </w:rPr>
-        <w:t xml:space="preserve">                          └──▶  Africa's Talking / Twilio  (SMS)</w:t>
+        <w:t xml:space="preserve">                          └──▶  Resend          (password-reset email)</w:t>
       </w:r>
     </w:p>
     <w:p>
@@ -3444,7 +3460,105 @@
           <w:sz w:val="21"/>
           <w:szCs w:val="21"/>
         </w:rPr>
-        <w:t xml:space="preserve">Flutterwave Standard checkout. The rules:</w:t>
+        <w:t xml:space="preserve">Two payment providers behind one seam, </w:t>
+      </w:r>
+      <w:r>
+        <w:rPr>
+          <w:rFonts w:ascii="Consolas" w:cs="Consolas" w:eastAsia="Consolas" w:hAnsi="Consolas"/>
+          <w:color w:val="111827"/>
+          <w:sz w:val="19"/>
+          <w:szCs w:val="19"/>
+        </w:rPr>
+        <w:t xml:space="preserve">payment-provider.ts</w:t>
+      </w:r>
+      <w:r>
+        <w:rPr>
+          <w:color w:val="111827"/>
+          <w:sz w:val="21"/>
+          <w:szCs w:val="21"/>
+        </w:rPr>
+        <w:t xml:space="preserve">, selected by </w:t>
+      </w:r>
+      <w:r>
+        <w:rPr>
+          <w:rFonts w:ascii="Consolas" w:cs="Consolas" w:eastAsia="Consolas" w:hAnsi="Consolas"/>
+          <w:color w:val="111827"/>
+          <w:sz w:val="19"/>
+          <w:szCs w:val="19"/>
+        </w:rPr>
+        <w:t xml:space="preserve">PAYMENT_PROVIDER</w:t>
+      </w:r>
+      <w:r>
+        <w:rPr>
+          <w:color w:val="111827"/>
+          <w:sz w:val="21"/>
+          <w:szCs w:val="21"/>
+        </w:rPr>
+        <w:t xml:space="preserve">. The </w:t>
+      </w:r>
+      <w:r>
+        <w:rPr>
+          <w:rFonts w:ascii="Consolas" w:cs="Consolas" w:eastAsia="Consolas" w:hAnsi="Consolas"/>
+          <w:color w:val="111827"/>
+          <w:sz w:val="19"/>
+          <w:szCs w:val="19"/>
+        </w:rPr>
+        <w:t xml:space="preserve">CheckoutResult</w:t>
+      </w:r>
+      <w:r>
+        <w:rPr>
+          <w:color w:val="111827"/>
+          <w:sz w:val="21"/>
+          <w:szCs w:val="21"/>
+        </w:rPr>
+        <w:t xml:space="preserve"> union names the two shapes a checkout can take: </w:t>
+      </w:r>
+      <w:r>
+        <w:rPr>
+          <w:rFonts w:ascii="Consolas" w:cs="Consolas" w:eastAsia="Consolas" w:hAnsi="Consolas"/>
+          <w:color w:val="111827"/>
+          <w:sz w:val="19"/>
+          <w:szCs w:val="19"/>
+        </w:rPr>
+        <w:t xml:space="preserve">redirect</w:t>
+      </w:r>
+      <w:r>
+        <w:rPr>
+          <w:color w:val="111827"/>
+          <w:sz w:val="21"/>
+          <w:szCs w:val="21"/>
+        </w:rPr>
+        <w:t xml:space="preserve"> (Flutterwave's hosted page) and </w:t>
+      </w:r>
+      <w:r>
+        <w:rPr>
+          <w:rFonts w:ascii="Consolas" w:cs="Consolas" w:eastAsia="Consolas" w:hAnsi="Consolas"/>
+          <w:color w:val="111827"/>
+          <w:sz w:val="19"/>
+          <w:szCs w:val="19"/>
+        </w:rPr>
+        <w:t xml:space="preserve">push</w:t>
+      </w:r>
+      <w:r>
+        <w:rPr>
+          <w:color w:val="111827"/>
+          <w:sz w:val="21"/>
+          <w:szCs w:val="21"/>
+        </w:rPr>
+        <w:t xml:space="preserve"> (MTN MoMo sends a prompt to the customer's phone and the app polls). The union is the point — a new provider cannot forget to say which flow it is at compile time.</w:t>
+      </w:r>
+    </w:p>
+    <w:p>
+      <w:pPr>
+        <w:spacing w:after="140" w:line="276"/>
+      </w:pPr>
+      <w:r>
+        <w:rPr>
+          <w:color w:val="111827"/>
+          <w:sz w:val="21"/>
+          <w:szCs w:val="21"/>
+        </w:rPr>
+        <w:t xml:space="preserve">The rules, whichever provider is live:</w:t>
       </w:r>
     </w:p>
     <w:p>
@@ -3472,20 +3586,37 @@
           <w:sz w:val="21"/>
           <w:szCs w:val="21"/>
         </w:rPr>
-        <w:t xml:space="preserve"> Both the webhook and the</w:t>
-      </w:r>
-    </w:p>
-    <w:p>
-      <w:pPr>
-        <w:spacing w:after="140" w:line="276"/>
-      </w:pPr>
-      <w:r>
-        <w:rPr>
-          <w:color w:val="111827"/>
-          <w:sz w:val="21"/>
-          <w:szCs w:val="21"/>
-        </w:rPr>
-        <w:t xml:space="preserve">redirect call Flutterwave's verify endpoint server-side first.</w:t>
+        <w:t xml:space="preserve"> Settlement always re-queries</w:t>
+      </w:r>
+    </w:p>
+    <w:p>
+      <w:pPr>
+        <w:spacing w:after="140" w:line="276"/>
+      </w:pPr>
+      <w:r>
+        <w:rPr>
+          <w:color w:val="111827"/>
+          <w:sz w:val="21"/>
+          <w:szCs w:val="21"/>
+        </w:rPr>
+        <w:t xml:space="preserve">the provider server-side for the transaction's real status, amount and currency (</w:t>
+      </w:r>
+      <w:r>
+        <w:rPr>
+          <w:rFonts w:ascii="Consolas" w:cs="Consolas" w:eastAsia="Consolas" w:hAnsi="Consolas"/>
+          <w:color w:val="111827"/>
+          <w:sz w:val="19"/>
+          <w:szCs w:val="19"/>
+        </w:rPr>
+        <w:t xml:space="preserve">checkAmount</w:t>
+      </w:r>
+      <w:r>
+        <w:rPr>
+          <w:color w:val="111827"/>
+          <w:sz w:val="21"/>
+          <w:szCs w:val="21"/>
+        </w:rPr>
+        <w:t xml:space="preserve">) before crediting anything.</w:t>
       </w:r>
     </w:p>
     <w:p>
@@ -3503,7 +3634,7 @@
           <w:sz w:val="21"/>
           <w:szCs w:val="21"/>
         </w:rPr>
-        <w:t xml:space="preserve">The webhook signature is checked against the </w:t>
+        <w:t xml:space="preserve">Flutterwave's webhook signature is checked against the </w:t>
       </w:r>
       <w:r>
         <w:rPr>
@@ -3520,20 +3651,20 @@
           <w:sz w:val="21"/>
           <w:szCs w:val="21"/>
         </w:rPr>
-        <w:t xml:space="preserve"> header with a</w:t>
-      </w:r>
-    </w:p>
-    <w:p>
-      <w:pPr>
-        <w:spacing w:after="140" w:line="276"/>
-      </w:pPr>
-      <w:r>
-        <w:rPr>
-          <w:color w:val="111827"/>
-          <w:sz w:val="21"/>
-          <w:szCs w:val="21"/>
-        </w:rPr>
-        <w:t xml:space="preserve">constant-time compare, and </w:t>
+        <w:t xml:space="preserve"> header</w:t>
+      </w:r>
+    </w:p>
+    <w:p>
+      <w:pPr>
+        <w:spacing w:after="140" w:line="276"/>
+      </w:pPr>
+      <w:r>
+        <w:rPr>
+          <w:color w:val="111827"/>
+          <w:sz w:val="21"/>
+          <w:szCs w:val="21"/>
+        </w:rPr>
+        <w:t xml:space="preserve">with a constant-time compare, and </w:t>
       </w:r>
       <w:r>
         <w:rPr>
@@ -3551,7 +3682,24 @@
           <w:sz w:val="21"/>
           <w:szCs w:val="21"/>
         </w:rPr>
-        <w:t xml:space="preserve"> — an unset secret must not mean "accept everything".</w:t>
+        <w:t xml:space="preserve">. MoMo's callbacks are unsigned, so the callback URL carries </w:t>
+      </w:r>
+      <w:r>
+        <w:rPr>
+          <w:rFonts w:ascii="Consolas" w:cs="Consolas" w:eastAsia="Consolas" w:hAnsi="Consolas"/>
+          <w:color w:val="111827"/>
+          <w:sz w:val="19"/>
+          <w:szCs w:val="19"/>
+        </w:rPr>
+        <w:t xml:space="preserve">MOMO_CALLBACK_SECRET</w:t>
+      </w:r>
+      <w:r>
+        <w:rPr>
+          <w:color w:val="111827"/>
+          <w:sz w:val="21"/>
+          <w:szCs w:val="21"/>
+        </w:rPr>
+        <w:t xml:space="preserve"> in its path and requests without it are rejected — and the callback is only a nudge to go verify, never trusted itself.</w:t>
       </w:r>
     </w:p>
     <w:p>
@@ -3565,50 +3713,89 @@
       </w:pPr>
       <w:r>
         <w:rPr>
-          <w:rFonts w:ascii="Consolas" w:cs="Consolas" w:eastAsia="Consolas" w:hAnsi="Consolas"/>
-          <w:color w:val="111827"/>
-          <w:sz w:val="19"/>
-          <w:szCs w:val="19"/>
-        </w:rPr>
-        <w:t xml:space="preserve">settleTransaction</w:t>
-      </w:r>
-      <w:r>
-        <w:rPr>
-          <w:color w:val="111827"/>
-          <w:sz w:val="21"/>
-          <w:szCs w:val="21"/>
-        </w:rPr>
-        <w:t xml:space="preserve"> is the single idempotent settlement path for both routes,</w:t>
-      </w:r>
-    </w:p>
-    <w:p>
-      <w:pPr>
-        <w:spacing w:after="140" w:line="276"/>
-      </w:pPr>
-      <w:r>
-        <w:rPr>
-          <w:color w:val="111827"/>
-          <w:sz w:val="21"/>
-          <w:szCs w:val="21"/>
-        </w:rPr>
-        <w:t xml:space="preserve">keyed on our own </w:t>
-      </w:r>
-      <w:r>
-        <w:rPr>
-          <w:rFonts w:ascii="Consolas" w:cs="Consolas" w:eastAsia="Consolas" w:hAnsi="Consolas"/>
-          <w:color w:val="111827"/>
-          <w:sz w:val="19"/>
-          <w:szCs w:val="19"/>
-        </w:rPr>
-        <w:t xml:space="preserve">tx_ref</w:t>
-      </w:r>
-      <w:r>
-        <w:rPr>
-          <w:color w:val="111827"/>
-          <w:sz w:val="21"/>
-          <w:szCs w:val="21"/>
-        </w:rPr>
-        <w:t xml:space="preserve">, so a replayed webhook cannot double-credit.</w:t>
+          <w:color w:val="111827"/>
+          <w:sz w:val="21"/>
+          <w:szCs w:val="21"/>
+        </w:rPr>
+        <w:t xml:space="preserve">Settlement is a single idempotent path keyed on our own reference, so a</w:t>
+      </w:r>
+    </w:p>
+    <w:p>
+      <w:pPr>
+        <w:spacing w:after="140" w:line="276"/>
+      </w:pPr>
+      <w:r>
+        <w:rPr>
+          <w:color w:val="111827"/>
+          <w:sz w:val="21"/>
+          <w:szCs w:val="21"/>
+        </w:rPr>
+        <w:t xml:space="preserve">replayed webhook or callback cannot double-credit.</w:t>
+      </w:r>
+    </w:p>
+    <w:p>
+      <w:pPr>
+        <w:pStyle w:val="ListParagraph"/>
+        <w:numPr>
+          <w:ilvl w:val="0"/>
+          <w:numId w:val="1"/>
+        </w:numPr>
+        <w:spacing w:after="60" w:line="264"/>
+      </w:pPr>
+      <w:r>
+        <w:rPr>
+          <w:color w:val="111827"/>
+          <w:sz w:val="21"/>
+          <w:szCs w:val="21"/>
+        </w:rPr>
+        <w:t xml:space="preserve">The MoMo sandbox settles EUR only; </w:t>
+      </w:r>
+      <w:r>
+        <w:rPr>
+          <w:rFonts w:ascii="Consolas" w:cs="Consolas" w:eastAsia="Consolas" w:hAnsi="Consolas"/>
+          <w:color w:val="111827"/>
+          <w:sz w:val="19"/>
+          <w:szCs w:val="19"/>
+        </w:rPr>
+        <w:t xml:space="preserve">isSandbox</w:t>
+      </w:r>
+      <w:r>
+        <w:rPr>
+          <w:color w:val="111827"/>
+          <w:sz w:val="21"/>
+          <w:szCs w:val="21"/>
+        </w:rPr>
+        <w:t xml:space="preserve"> relaxes exactly the currency</w:t>
+      </w:r>
+    </w:p>
+    <w:p>
+      <w:pPr>
+        <w:spacing w:after="140" w:line="276"/>
+      </w:pPr>
+      <w:r>
+        <w:rPr>
+          <w:color w:val="111827"/>
+          <w:sz w:val="21"/>
+          <w:szCs w:val="21"/>
+        </w:rPr>
+        <w:t xml:space="preserve">check and nothing else, and never in production. Text sent to the handset prompt goes through </w:t>
+      </w:r>
+      <w:r>
+        <w:rPr>
+          <w:rFonts w:ascii="Consolas" w:cs="Consolas" w:eastAsia="Consolas" w:hAnsi="Consolas"/>
+          <w:color w:val="111827"/>
+          <w:sz w:val="19"/>
+          <w:szCs w:val="19"/>
+        </w:rPr>
+        <w:t xml:space="preserve">toMomoText()</w:t>
+      </w:r>
+      <w:r>
+        <w:rPr>
+          <w:color w:val="111827"/>
+          <w:sz w:val="21"/>
+          <w:szCs w:val="21"/>
+        </w:rPr>
+        <w:t xml:space="preserve"> — MTN rejects non-ASCII with a bodyless 400, which once broke every checkout on an em dash.</w:t>
       </w:r>
     </w:p>
     <w:p>
@@ -3638,7 +3825,121 @@
           <w:sz w:val="21"/>
           <w:szCs w:val="21"/>
         </w:rPr>
-        <w:t xml:space="preserve">BizPilot's own books: MRR, ARR, trials in flight, trials ending within seven days, churn, cash collected by month, signups by week, and cost-to-serve (SMS + estimated AI) against revenue. Plus a table of every shop with usage, so a trial that is actually being used can be told apart from one that is not.</w:t>
+        <w:t xml:space="preserve">Two halves behind the same </w:t>
+      </w:r>
+      <w:r>
+        <w:rPr>
+          <w:rFonts w:ascii="Consolas" w:cs="Consolas" w:eastAsia="Consolas" w:hAnsi="Consolas"/>
+          <w:color w:val="111827"/>
+          <w:sz w:val="19"/>
+          <w:szCs w:val="19"/>
+        </w:rPr>
+        <w:t xml:space="preserve">PlatformAdminGuard</w:t>
+      </w:r>
+      <w:r>
+        <w:rPr>
+          <w:color w:val="111827"/>
+          <w:sz w:val="21"/>
+          <w:szCs w:val="21"/>
+        </w:rPr>
+        <w:t xml:space="preserve">.</w:t>
+      </w:r>
+    </w:p>
+    <w:p>
+      <w:pPr>
+        <w:spacing w:after="140" w:line="276"/>
+      </w:pPr>
+      <w:r>
+        <w:rPr>
+          <w:b/>
+          <w:bCs/>
+          <w:color w:val="111827"/>
+          <w:sz w:val="21"/>
+          <w:szCs w:val="21"/>
+        </w:rPr>
+        <w:t xml:space="preserve">The books</w:t>
+      </w:r>
+      <w:r>
+        <w:rPr>
+          <w:color w:val="111827"/>
+          <w:sz w:val="21"/>
+          <w:szCs w:val="21"/>
+        </w:rPr>
+        <w:t xml:space="preserve"> (</w:t>
+      </w:r>
+      <w:r>
+        <w:rPr>
+          <w:rFonts w:ascii="Consolas" w:cs="Consolas" w:eastAsia="Consolas" w:hAnsi="Consolas"/>
+          <w:color w:val="111827"/>
+          <w:sz w:val="19"/>
+          <w:szCs w:val="19"/>
+        </w:rPr>
+        <w:t xml:space="preserve">admin.service.ts</w:t>
+      </w:r>
+      <w:r>
+        <w:rPr>
+          <w:color w:val="111827"/>
+          <w:sz w:val="21"/>
+          <w:szCs w:val="21"/>
+        </w:rPr>
+        <w:t xml:space="preserve">): MRR, ARR, trials in flight, trials ending within seven days, churn, cash collected by month, signups by week, and cost-to-serve against revenue — SMS at gateway-reported cost, AI priced from the real token counts recorded on every assistant reply. Plus a table of every shop with usage, so a trial that is actually being used can be told apart from one that is not.</w:t>
+      </w:r>
+    </w:p>
+    <w:p>
+      <w:pPr>
+        <w:spacing w:after="140" w:line="276"/>
+      </w:pPr>
+      <w:r>
+        <w:rPr>
+          <w:b/>
+          <w:bCs/>
+          <w:color w:val="111827"/>
+          <w:sz w:val="21"/>
+          <w:szCs w:val="21"/>
+        </w:rPr>
+        <w:t xml:space="preserve">The controls</w:t>
+      </w:r>
+      <w:r>
+        <w:rPr>
+          <w:color w:val="111827"/>
+          <w:sz w:val="21"/>
+          <w:szCs w:val="21"/>
+        </w:rPr>
+        <w:t xml:space="preserve"> (</w:t>
+      </w:r>
+      <w:r>
+        <w:rPr>
+          <w:rFonts w:ascii="Consolas" w:cs="Consolas" w:eastAsia="Consolas" w:hAnsi="Consolas"/>
+          <w:color w:val="111827"/>
+          <w:sz w:val="19"/>
+          <w:szCs w:val="19"/>
+        </w:rPr>
+        <w:t xml:space="preserve">admin-management.service.ts</w:t>
+      </w:r>
+      <w:r>
+        <w:rPr>
+          <w:color w:val="111827"/>
+          <w:sz w:val="21"/>
+          <w:szCs w:val="21"/>
+        </w:rPr>
+        <w:t xml:space="preserve">): suspend and restore shops, change plans, deactivate users and change roles, browse payments, read the audit trail. Every mutation requires a written reason and writes an </w:t>
+      </w:r>
+      <w:r>
+        <w:rPr>
+          <w:rFonts w:ascii="Consolas" w:cs="Consolas" w:eastAsia="Consolas" w:hAnsi="Consolas"/>
+          <w:color w:val="111827"/>
+          <w:sz w:val="19"/>
+          <w:szCs w:val="19"/>
+        </w:rPr>
+        <w:t xml:space="preserve">AuditLog</w:t>
+      </w:r>
+      <w:r>
+        <w:rPr>
+          <w:color w:val="111827"/>
+          <w:sz w:val="21"/>
+          <w:szCs w:val="21"/>
+        </w:rPr>
+        <w:t xml:space="preserve"> row carrying the acting admin's email and IP. Guard rails are structural: an admin cannot act on their own account, on another platform admin, or suspend a business a platform admin belongs to; the last owner of a business cannot be demoted.</w:t>
       </w:r>
     </w:p>
     <w:p>
@@ -3686,6 +3987,70 @@
           <w:szCs w:val="21"/>
         </w:rPr>
         <w:t xml:space="preserve"> environment variable rather than a database column — nobody can grant it from inside the product, and an empty list means nobody rather than everybody.</w:t>
+      </w:r>
+    </w:p>
+    <w:p>
+      <w:pPr>
+        <w:pStyle w:val="Heading3"/>
+        <w:spacing w:after="120" w:before="300"/>
+      </w:pPr>
+      <w:r>
+        <w:rPr>
+          <w:rFonts w:ascii="Consolas" w:cs="Consolas" w:eastAsia="Consolas" w:hAnsi="Consolas"/>
+          <w:b/>
+          <w:bCs/>
+          <w:color w:val="111827"/>
+          <w:sz w:val="19"/>
+          <w:szCs w:val="19"/>
+        </w:rPr>
+        <w:t xml:space="preserve">mail/</w:t>
+      </w:r>
+    </w:p>
+    <w:p>
+      <w:pPr>
+        <w:spacing w:after="140" w:line="276"/>
+      </w:pPr>
+      <w:r>
+        <w:rPr>
+          <w:color w:val="111827"/>
+          <w:sz w:val="21"/>
+          <w:szCs w:val="21"/>
+        </w:rPr>
+        <w:t xml:space="preserve">The same provider seam as SMS, one size smaller: </w:t>
+      </w:r>
+      <w:r>
+        <w:rPr>
+          <w:rFonts w:ascii="Consolas" w:cs="Consolas" w:eastAsia="Consolas" w:hAnsi="Consolas"/>
+          <w:color w:val="111827"/>
+          <w:sz w:val="19"/>
+          <w:szCs w:val="19"/>
+        </w:rPr>
+        <w:t xml:space="preserve">log</w:t>
+      </w:r>
+      <w:r>
+        <w:rPr>
+          <w:color w:val="111827"/>
+          <w:sz w:val="21"/>
+          <w:szCs w:val="21"/>
+        </w:rPr>
+        <w:t xml:space="preserve"> (development — the password-reset link prints to the server log) and </w:t>
+      </w:r>
+      <w:r>
+        <w:rPr>
+          <w:rFonts w:ascii="Consolas" w:cs="Consolas" w:eastAsia="Consolas" w:hAnsi="Consolas"/>
+          <w:color w:val="111827"/>
+          <w:sz w:val="19"/>
+          <w:szCs w:val="19"/>
+        </w:rPr>
+        <w:t xml:space="preserve">resend</w:t>
+      </w:r>
+      <w:r>
+        <w:rPr>
+          <w:color w:val="111827"/>
+          <w:sz w:val="21"/>
+          <w:szCs w:val="21"/>
+        </w:rPr>
+        <w:t xml:space="preserve"> (one POST to Resend's REST API, no SDK). Only password resets send email today; trial-ending notices would reuse this seam.</w:t>
       </w:r>
     </w:p>
     <w:p>
@@ -5503,7 +5868,75 @@
           <w:sz w:val="21"/>
           <w:szCs w:val="21"/>
         </w:rPr>
-        <w:t xml:space="preserve">, the Flutterwave keys, and the SMS credentials.</w:t>
+        <w:t xml:space="preserve">, the payment provider's keys (</w:t>
+      </w:r>
+      <w:r>
+        <w:rPr>
+          <w:rFonts w:ascii="Consolas" w:cs="Consolas" w:eastAsia="Consolas" w:hAnsi="Consolas"/>
+          <w:color w:val="111827"/>
+          <w:sz w:val="19"/>
+          <w:szCs w:val="19"/>
+        </w:rPr>
+        <w:t xml:space="preserve">MOMO_*</w:t>
+      </w:r>
+      <w:r>
+        <w:rPr>
+          <w:color w:val="111827"/>
+          <w:sz w:val="21"/>
+          <w:szCs w:val="21"/>
+        </w:rPr>
+        <w:t xml:space="preserve"> or </w:t>
+      </w:r>
+      <w:r>
+        <w:rPr>
+          <w:rFonts w:ascii="Consolas" w:cs="Consolas" w:eastAsia="Consolas" w:hAnsi="Consolas"/>
+          <w:color w:val="111827"/>
+          <w:sz w:val="19"/>
+          <w:szCs w:val="19"/>
+        </w:rPr>
+        <w:t xml:space="preserve">FLUTTERWAVE_*</w:t>
+      </w:r>
+      <w:r>
+        <w:rPr>
+          <w:color w:val="111827"/>
+          <w:sz w:val="21"/>
+          <w:szCs w:val="21"/>
+        </w:rPr>
+        <w:t xml:space="preserve">), the SMS credentials, and the mail credentials (</w:t>
+      </w:r>
+      <w:r>
+        <w:rPr>
+          <w:rFonts w:ascii="Consolas" w:cs="Consolas" w:eastAsia="Consolas" w:hAnsi="Consolas"/>
+          <w:color w:val="111827"/>
+          <w:sz w:val="19"/>
+          <w:szCs w:val="19"/>
+        </w:rPr>
+        <w:t xml:space="preserve">RESEND_API_KEY</w:t>
+      </w:r>
+      <w:r>
+        <w:rPr>
+          <w:color w:val="111827"/>
+          <w:sz w:val="21"/>
+          <w:szCs w:val="21"/>
+        </w:rPr>
+        <w:t xml:space="preserve"> / </w:t>
+      </w:r>
+      <w:r>
+        <w:rPr>
+          <w:rFonts w:ascii="Consolas" w:cs="Consolas" w:eastAsia="Consolas" w:hAnsi="Consolas"/>
+          <w:color w:val="111827"/>
+          <w:sz w:val="19"/>
+          <w:szCs w:val="19"/>
+        </w:rPr>
+        <w:t xml:space="preserve">MAIL_FROM</w:t>
+      </w:r>
+      <w:r>
+        <w:rPr>
+          <w:color w:val="111827"/>
+          <w:sz w:val="21"/>
+          <w:szCs w:val="21"/>
+        </w:rPr>
+        <w:t xml:space="preserve">) so password resets deliver.</w:t>
       </w:r>
     </w:p>
     <w:p>

</xml_diff>